<commit_message>
Book 1: add years, editions and places to the Selected Bibliography (publisher's list; Hamilton 2nd ed. 2005 and Longman and Dillard 2nd ed. 2006 checked online); rebuilt interior, still 240 pages
Co-Authored-By: Claude Sonnet 5.5 <noreply@anthropic.com>
Claude-Session: https://claude.ai/code/session_01BbCk2dKJvxDH6ki3CFHEXN
</commit_message>
<xml_diff>
--- a/build-tools/books/full-framework/The_Full_Framework_Print_Interior_Editable_6x9_v11_with_Bibliography.docx
+++ b/build-tools/books/full-framework/The_Full_Framework_Print_Interior_Editable_6x9_v11_with_Bibliography.docx
@@ -42354,7 +42354,7 @@
         <w:t xml:space="preserve">The Macmillan Bible Atlas</w:t>
       </w:r>
       <w:r>
-        <w:t xml:space="preserve">. New York: Macmillan.</w:t>
+        <w:t xml:space="preserve">. Rev. ed. New York: Macmillan, 1977.</w:t>
       </w:r>
     </w:p>
     <w:p>
@@ -42373,7 +42373,7 @@
         <w:t xml:space="preserve">The Brown-Driver-Briggs Hebrew and English Lexicon</w:t>
       </w:r>
       <w:r>
-        <w:t xml:space="preserve">. Peabody, MA: Hendrickson Publishers.</w:t>
+        <w:t xml:space="preserve">. Peabody, MA: Hendrickson Publishers. First published 1906.</w:t>
       </w:r>
     </w:p>
     <w:p>
@@ -42392,7 +42392,7 @@
         <w:t xml:space="preserve">The New Treasury of Scripture Knowledge</w:t>
       </w:r>
       <w:r>
-        <w:t xml:space="preserve">. Nashville: Thomas Nelson.</w:t>
+        <w:t xml:space="preserve">. Nashville: Thomas Nelson, 1992.</w:t>
       </w:r>
     </w:p>
     <w:p>
@@ -42476,7 +42476,7 @@
         <w:t xml:space="preserve">A Dispensational Theology</w:t>
       </w:r>
       <w:r>
-        <w:t xml:space="preserve">. Grand Rapids: Grace Publications.</w:t>
+        <w:t xml:space="preserve">. Grand Rapids: Grace Publications, 1971.</w:t>
       </w:r>
     </w:p>
     <w:p>
@@ -42495,7 +42495,7 @@
         <w:t xml:space="preserve">The Companion Bible</w:t>
       </w:r>
       <w:r>
-        <w:t xml:space="preserve">. Grand Rapids: Kregel Publications.</w:t>
+        <w:t xml:space="preserve">. London: Oxford University Press, 1922.</w:t>
       </w:r>
     </w:p>
     <w:p>
@@ -42533,7 +42533,7 @@
         <w:t xml:space="preserve">Dispensationalism</w:t>
       </w:r>
       <w:r>
-        <w:t xml:space="preserve">. Chicago: Moody Publishers.</w:t>
+        <w:t xml:space="preserve">. Chicago: Moody Press, 1965. Rev. ed., 1995.</w:t>
       </w:r>
     </w:p>
     <w:p>
@@ -42571,7 +42571,7 @@
         <w:t xml:space="preserve">Things That Differ</w:t>
       </w:r>
       <w:r>
-        <w:t xml:space="preserve">. Chicago: Berean Bible Society.</w:t>
+        <w:t xml:space="preserve">. Germantown, WI: Berean Bible Society, 1951.</w:t>
       </w:r>
     </w:p>
     <w:p>
@@ -42590,7 +42590,7 @@
         <w:t xml:space="preserve">Dispensational Truth</w:t>
       </w:r>
       <w:r>
-        <w:t xml:space="preserve">. London: The Berean Publishing Trust.</w:t>
+        <w:t xml:space="preserve">. London: The Berean Publishing Trust, 1957.</w:t>
       </w:r>
     </w:p>
     <w:p>
@@ -42636,7 +42636,7 @@
         <w:t xml:space="preserve">The Works of Josephus</w:t>
       </w:r>
       <w:r>
-        <w:t xml:space="preserve">. Translated by William Whiston. Peabody, MA: Hendrickson Publishers.</w:t>
+        <w:t xml:space="preserve">. Translated by William Whiston. Peabody, MA: Hendrickson Publishers, 1987. Whiston’s translation first published 1737.</w:t>
       </w:r>
     </w:p>
     <w:p>
@@ -42655,7 +42655,7 @@
         <w:t xml:space="preserve">Acts</w:t>
       </w:r>
       <w:r>
-        <w:t xml:space="preserve">. Tyndale New Testament Commentaries. Downers Grove, IL: InterVarsity Press.</w:t>
+        <w:t xml:space="preserve">. Tyndale New Testament Commentaries. Downers Grove, IL: InterVarsity Press, 1980.</w:t>
       </w:r>
     </w:p>
     <w:p>
@@ -42674,7 +42674,7 @@
         <w:t xml:space="preserve">Acts</w:t>
       </w:r>
       <w:r>
-        <w:t xml:space="preserve">. New American Commentary. Nashville: Broadman &amp; Holman.</w:t>
+        <w:t xml:space="preserve">. New American Commentary. Nashville: Broadman &amp; Holman, 1992.</w:t>
       </w:r>
     </w:p>
     <w:p>
@@ -42701,7 +42701,7 @@
         <w:t xml:space="preserve">A New Testament Biblical Theology</w:t>
       </w:r>
       <w:r>
-        <w:t xml:space="preserve">. Grand Rapids: Baker Academic.</w:t>
+        <w:t xml:space="preserve">. Grand Rapids: Baker Academic, 2011.</w:t>
       </w:r>
     </w:p>
     <w:p>
@@ -42720,7 +42720,7 @@
         <w:t xml:space="preserve">Handbook on the Pentateuch</w:t>
       </w:r>
       <w:r>
-        <w:t xml:space="preserve">. Grand Rapids: Baker Academic.</w:t>
+        <w:t xml:space="preserve">. 2nd ed. Grand Rapids: Baker Academic, 2005.</w:t>
       </w:r>
     </w:p>
     <w:p>
@@ -42739,7 +42739,7 @@
         <w:t xml:space="preserve">The Messiah in the Old Testament</w:t>
       </w:r>
       <w:r>
-        <w:t xml:space="preserve">. Grand Rapids: Zondervan.</w:t>
+        <w:t xml:space="preserve">. Grand Rapids: Zondervan, 1995.</w:t>
       </w:r>
     </w:p>
     <w:p>
@@ -42758,7 +42758,7 @@
         <w:t xml:space="preserve">Ancient Near Eastern Thought and the Old Testament</w:t>
       </w:r>
       <w:r>
-        <w:t xml:space="preserve">. Grand Rapids: Baker Academic.</w:t>
+        <w:t xml:space="preserve">. Grand Rapids: Baker Academic, 2006.</w:t>
       </w:r>
     </w:p>
     <w:p>
@@ -42785,7 +42785,7 @@
         <w:t xml:space="preserve">Commentary on the New Testament Use of the Old Testament</w:t>
       </w:r>
       <w:r>
-        <w:t xml:space="preserve">. Grand Rapids: Baker Academic.</w:t>
+        <w:t xml:space="preserve">. Grand Rapids: Baker Academic, 2007.</w:t>
       </w:r>
     </w:p>
     <w:p>
@@ -42804,7 +42804,7 @@
         <w:t xml:space="preserve">Echoes of Scripture in the Gospels</w:t>
       </w:r>
       <w:r>
-        <w:t xml:space="preserve">. Waco, TX: Baylor University Press.</w:t>
+        <w:t xml:space="preserve">. Waco, TX: Baylor University Press, 2016.</w:t>
       </w:r>
     </w:p>
     <w:p>
@@ -42823,7 +42823,7 @@
         <w:t xml:space="preserve">Echoes of Scripture in the Letters of Paul</w:t>
       </w:r>
       <w:r>
-        <w:t xml:space="preserve">. New Haven: Yale University Press.</w:t>
+        <w:t xml:space="preserve">. New Haven: Yale University Press, 1989.</w:t>
       </w:r>
     </w:p>
     <w:p>
@@ -42851,7 +42851,7 @@
         <w:t xml:space="preserve">New Testament Commentary Survey</w:t>
       </w:r>
       <w:r>
-        <w:t xml:space="preserve">. Grand Rapids: Baker Academic.</w:t>
+        <w:t xml:space="preserve">. 6th ed. Grand Rapids: Baker Academic, 2007.</w:t>
       </w:r>
     </w:p>
     <w:p>
@@ -42871,7 +42871,7 @@
         <w:t xml:space="preserve">How to Read the Bible for All Its Worth</w:t>
       </w:r>
       <w:r>
-        <w:t xml:space="preserve">. Grand Rapids: Zondervan.</w:t>
+        <w:t xml:space="preserve">. 4th ed. Grand Rapids: Zondervan, 2014. First published 1981.</w:t>
       </w:r>
     </w:p>
     <w:p>
@@ -42890,7 +42890,7 @@
         <w:t xml:space="preserve">An Introduction to the Old Testament</w:t>
       </w:r>
       <w:r>
-        <w:t xml:space="preserve">. Grand Rapids: Zondervan.</w:t>
+        <w:t xml:space="preserve">. 2nd ed. Grand Rapids: Zondervan, 2006.</w:t>
       </w:r>
     </w:p>
     <w:sectPr>

</xml_diff>

<commit_message>
Book 1 bibliography: Strong publisher, Stam place and title, Welch title and year corrected from catalog records; still 240 pages
Co-Authored-By: Claude Sonnet 5.5 <noreply@anthropic.com>
Claude-Session: https://claude.ai/code/session_01BbCk2dKJvxDH6ki3CFHEXN
</commit_message>
<xml_diff>
--- a/build-tools/books/full-framework/The_Full_Framework_Print_Interior_Editable_6x9_v11_with_Bibliography.docx
+++ b/build-tools/books/full-framework/The_Full_Framework_Print_Interior_Editable_6x9_v11_with_Bibliography.docx
@@ -42411,7 +42411,7 @@
         <w:t xml:space="preserve">The Exhaustive Concordance of the Bible</w:t>
       </w:r>
       <w:r>
-        <w:t xml:space="preserve">. Nashville: Abingdon Press, 1890.</w:t>
+        <w:t xml:space="preserve">. New York: Hunt &amp; Eaton; Cincinnati: Cranston &amp; Curts, 1890.</w:t>
       </w:r>
     </w:p>
     <w:p>
@@ -42568,10 +42568,10 @@
         <w:rPr>
           <w:i/>
         </w:rPr>
-        <w:t xml:space="preserve">Things That Differ</w:t>
-      </w:r>
-      <w:r>
-        <w:t xml:space="preserve">. Germantown, WI: Berean Bible Society, 1951.</w:t>
+        <w:t xml:space="preserve">Things That Differ: The Fundamentals of Dispensationalism</w:t>
+      </w:r>
+      <w:r>
+        <w:t xml:space="preserve">. Chicago: Berean Bible Society, 1951.</w:t>
       </w:r>
     </w:p>
     <w:p>
@@ -42587,10 +42587,10 @@
         <w:rPr>
           <w:i/>
         </w:rPr>
-        <w:t xml:space="preserve">Dispensational Truth</w:t>
-      </w:r>
-      <w:r>
-        <w:t xml:space="preserve">. London: The Berean Publishing Trust, 1957.</w:t>
+        <w:t xml:space="preserve">Dispensational Truth: Or, The Place of Israel and the Church in the Purpose of the Ages</w:t>
+      </w:r>
+      <w:r>
+        <w:t xml:space="preserve">. London: The Berean Publishing Trust, 1959.</w:t>
       </w:r>
     </w:p>
     <w:p>

</xml_diff>